<commit_message>
docs: manual 16.3-16.5 corrigido com o HH rate ligado (horas executadas x faturaveis)
</commit_message>
<xml_diff>
--- a/docs/kiadynbc-manual-usuario-v5.docx
+++ b/docs/kiadynbc-manual-usuario-v5.docx
@@ -39,7 +39,7 @@
           <w:i/>
           <w:sz w:val="20"/>
         </w:rPr>
-        <w:t>RSBTech · Dynamics 365 Business Central · 27/10/2026 · versão 1.1.7.0</w:t>
+        <w:t>RSBTech · Dynamics 365 Business Central · 27/10/2026 · versão 1.1.8.0</w:t>
       </w:r>
     </w:p>
     <w:p/>
@@ -2028,7 +2028,53 @@
           <w:b w:val="0"/>
           <w:i w:val="0"/>
         </w:rPr>
-        <w:t>Na linha do ticket, o campo Tipo de Serviço define qual taxa será buscada. O sistema pega a taxa ATIVA vigente na data do serviço e calcula: valor da mão de obra = horas × taxa. Se as horas executadas ficarem abaixo do mínimo faturável do fornecedor, as horas sobem para o mínimo e a linha é marcada com Mínimo de Horas Aplicado.</w:t>
+        <w:t>Na linha do ticket, marque o Tipo de Linha como Mão de Obra (HH) e escolha o Tipo de Serviço — é ele que seleciona qual taxa será buscada. A taxa não é digitada: o campo HH Rate é somente leitura e vem do cadastro do fornecedor.</w:t>
+      </w:r>
+    </w:p>
+    <w:p>
+      <w:pPr>
+        <w:pStyle w:val="Heading2"/>
+      </w:pPr>
+      <w:r>
+        <w:rPr>
+          <w:color w:val="0E7C86"/>
+          <w:sz w:val="26"/>
+        </w:rPr>
+        <w:t>16.4 Horas trabalhadas x horas faturáveis</w:t>
+      </w:r>
+    </w:p>
+    <w:p>
+      <w:r>
+        <w:rPr>
+          <w:b w:val="0"/>
+          <w:i w:val="0"/>
+        </w:rPr>
+        <w:t>São dois números diferentes, e o sistema guarda os dois:</w:t>
+      </w:r>
+    </w:p>
+    <w:p>
+      <w:pPr>
+        <w:pStyle w:val="ListBullet"/>
+      </w:pPr>
+      <w:r>
+        <w:t>Horas: o que o técnico executou de fato. Nunca é alterado pelo sistema.</w:t>
+      </w:r>
+    </w:p>
+    <w:p>
+      <w:pPr>
+        <w:pStyle w:val="ListBullet"/>
+      </w:pPr>
+      <w:r>
+        <w:t>Horas Faturáveis: o que se cobra = o maior entre as horas executadas e o mínimo faturável do fornecedor.</w:t>
+      </w:r>
+    </w:p>
+    <w:p>
+      <w:r>
+        <w:rPr>
+          <w:b w:val="0"/>
+          <w:i w:val="0"/>
+        </w:rPr>
+        <w:t>Exemplo: execução de 1h com mínimo de 2h no cadastro. As Horas continuam 1 (o serviço durou 1 hora), as Horas Faturáveis ficam 2 e a linha é marcada com Mínimo de Horas Aplicado. O valor cobrado é 2 × taxa.</w:t>
       </w:r>
     </w:p>
     <w:p>
@@ -2037,7 +2083,52 @@
           <w:b/>
           <w:color w:val="B45000"/>
         </w:rPr>
-        <w:t>⚠ Corrigir a tabela de taxas depois não reescreve ticket já faturado: só a linha com o tipo de serviço preenchido é recalculada, e apenas antes do faturamento.</w:t>
+        <w:t>⚠ O mínimo nunca apaga as horas executadas. Se as horas trabalhadas fossem sobrescritas pelo mínimo, o histórico perderia o registro do que realmente aconteceu — e não haveria como auditar depois se o serviço foi rápido ou demorado.</w:t>
+      </w:r>
+    </w:p>
+    <w:p>
+      <w:pPr>
+        <w:pStyle w:val="Heading2"/>
+      </w:pPr>
+      <w:r>
+        <w:rPr>
+          <w:color w:val="0E7C86"/>
+          <w:sz w:val="26"/>
+        </w:rPr>
+        <w:t>16.5 Quando a taxa é aplicada</w:t>
+      </w:r>
+    </w:p>
+    <w:p>
+      <w:pPr>
+        <w:pStyle w:val="ListBullet"/>
+      </w:pPr>
+      <w:r>
+        <w:t>Na ação Apply Labor Rates, dentro do ticket, para aplicar na hora e ver o resultado.</w:t>
+      </w:r>
+    </w:p>
+    <w:p>
+      <w:pPr>
+        <w:pStyle w:val="ListBullet"/>
+      </w:pPr>
+      <w:r>
+        <w:t>Ao validar o ticket (Validate), que garante a taxa preenchida antes de aprovar.</w:t>
+      </w:r>
+    </w:p>
+    <w:p>
+      <w:pPr>
+        <w:pStyle w:val="ListBullet"/>
+      </w:pPr>
+      <w:r>
+        <w:t>Antes de faturar, ao cobrar do cliente: a taxa vigente é reaplicada, para o cliente ser cobrado pelo valor certo mesmo que a tabela tenha sido corrigida depois da execução.</w:t>
+      </w:r>
+    </w:p>
+    <w:p>
+      <w:r>
+        <w:rPr>
+          <w:b w:val="0"/>
+          <w:i w:val="0"/>
+        </w:rPr>
+        <w:t>A data usada é a Data de Serviço do ticket, não a data de hoje. Assim, reprocessar um ticket antigo traz a taxa que valia na época do serviço.</w:t>
       </w:r>
     </w:p>
     <w:p>

</xml_diff>